<commit_message>
Final Hackathon Submission: AI HR Agent Cleaned
</commit_message>
<xml_diff>
--- a/ET_Hackathon/Architecture_Document.docx
+++ b/ET_Hackathon/Architecture_Document.docx
@@ -4,19 +4,17 @@
   <w:body>
     <w:p>
       <w:pPr>
-        <w:pStyle w:val="Heading3"/>
+        <w:pStyle w:val="ListParagraph"/>
         <w:jc w:val="center"/>
         <w:rPr>
-          <w:rFonts w:ascii="Algerian" w:hAnsi="Algerian"/>
-          <w:color w:val="000000" w:themeColor="text1"/>
+          <w:rStyle w:val="Strong"/>
           <w:sz w:val="32"/>
           <w:szCs w:val="32"/>
         </w:rPr>
       </w:pPr>
       <w:r>
         <w:rPr>
-          <w:rFonts w:ascii="Algerian" w:hAnsi="Algerian"/>
-          <w:color w:val="000000" w:themeColor="text1"/>
+          <w:rStyle w:val="Strong"/>
           <w:sz w:val="32"/>
           <w:szCs w:val="32"/>
         </w:rPr>
@@ -25,26 +23,14 @@
     </w:p>
     <w:p>
       <w:pPr>
-        <w:pStyle w:val="Heading3"/>
-      </w:pPr>
-    </w:p>
-    <w:p>
-      <w:pPr>
-        <w:pStyle w:val="Heading3"/>
-      </w:pPr>
-      <w:r>
-        <w:t xml:space="preserve">Project </w:t>
-      </w:r>
-      <w:proofErr w:type="gramStart"/>
-      <w:r>
-        <w:t>Abstract</w:t>
-      </w:r>
-      <w:r>
-        <w:t xml:space="preserve"> :</w:t>
-      </w:r>
-      <w:bookmarkStart w:id="0" w:name="_GoBack"/>
-      <w:bookmarkEnd w:id="0"/>
-      <w:proofErr w:type="gramEnd"/>
+        <w:pStyle w:val="ListParagraph"/>
+        <w:jc w:val="center"/>
+        <w:rPr>
+          <w:rStyle w:val="Strong"/>
+          <w:sz w:val="32"/>
+          <w:szCs w:val="32"/>
+        </w:rPr>
+      </w:pPr>
     </w:p>
     <w:p>
       <w:pPr>
@@ -55,10 +41,10 @@
           <w:b/>
           <w:bCs/>
         </w:rPr>
-        <w:t>Title:</w:t>
-      </w:r>
-      <w:r>
-        <w:t xml:space="preserve"> Automated HR Onboarding Intelligence Agent</w:t>
+        <w:t>Project:</w:t>
+      </w:r>
+      <w:r>
+        <w:t xml:space="preserve"> AI-HR-Agent (Team ET)</w:t>
       </w:r>
     </w:p>
     <w:p>
@@ -70,58 +56,56 @@
           <w:b/>
           <w:bCs/>
         </w:rPr>
-        <w:t>Objective:</w:t>
-      </w:r>
-      <w:r>
-        <w:t xml:space="preserve"> To streamline the corporate onboarding process by transforming fragmented employee data into professional summaries using Generative AI.</w:t>
+        <w:t>Core Engine:</w:t>
+      </w:r>
+      <w:r>
+        <w:t xml:space="preserve"> Gemini 1.5 Flash</w:t>
       </w:r>
     </w:p>
     <w:p>
       <w:pPr>
+        <w:pStyle w:val="Heading3"/>
+      </w:pPr>
+      <w:r>
+        <w:t>1. Agent Roles &amp; Workflow</w:t>
+      </w:r>
+    </w:p>
+    <w:p>
+      <w:pPr>
         <w:pStyle w:val="NormalWeb"/>
+        <w:numPr>
+          <w:ilvl w:val="0"/>
+          <w:numId w:val="2"/>
+        </w:numPr>
       </w:pPr>
       <w:r>
         <w:rPr>
           <w:b/>
           <w:bCs/>
         </w:rPr>
-        <w:t>Summary:</w:t>
-      </w:r>
-      <w:r>
-        <w:t xml:space="preserve"> This solution leverages the </w:t>
-      </w:r>
+        <w:t>The Orchestrator:</w:t>
+      </w:r>
+      <w:r>
+        <w:t xml:space="preserve"> The Streamlit UI acts as the entry point for document ingestion.</w:t>
+      </w:r>
+    </w:p>
+    <w:p>
+      <w:pPr>
+        <w:pStyle w:val="NormalWeb"/>
+        <w:numPr>
+          <w:ilvl w:val="0"/>
+          <w:numId w:val="2"/>
+        </w:numPr>
+      </w:pPr>
       <w:r>
         <w:rPr>
           <w:b/>
           <w:bCs/>
         </w:rPr>
-        <w:t>Gemini 2.5 Flash API</w:t>
-      </w:r>
-      <w:r>
-        <w:t xml:space="preserve"> to automate the time-consuming task of drafting new hire summaries. By implementing a secure backend architecture using Python and environment variables, the system ensures 100% data integrity and security while reducing administrative overhead by over 95%.</w:t>
-      </w:r>
-    </w:p>
-    <w:p>
-      <w:r>
-        <w:pict w14:anchorId="08D01E9C">
-          <v:rect id="_x0000_i1025" style="width:0;height:1.5pt" o:hralign="center" o:hrstd="t" o:hr="t" fillcolor="#a0a0a0" stroked="f"/>
-        </w:pict>
-      </w:r>
-    </w:p>
-    <w:p>
-      <w:pPr>
-        <w:pStyle w:val="Heading3"/>
-      </w:pPr>
-      <w:r>
-        <w:t xml:space="preserve"> Next: The User Flow Diagram</w:t>
-      </w:r>
-    </w:p>
-    <w:p>
-      <w:pPr>
-        <w:pStyle w:val="NormalWeb"/>
-      </w:pPr>
-      <w:r>
-        <w:t>To make your Architecture document even more "exciting," you should include a diagram. Since you are turning in a Word file, you can describe this flow in a "Process Chart" style:</w:t>
+        <w:t>The Vision Agent:</w:t>
+      </w:r>
+      <w:r>
+        <w:t xml:space="preserve"> Powered by Gemini 1.5 Flash, this agent autonomously identifies the ID type and extracts unstructured text into a structured JSON format.</w:t>
       </w:r>
     </w:p>
     <w:p>
@@ -129,33 +113,36 @@
         <w:pStyle w:val="NormalWeb"/>
         <w:numPr>
           <w:ilvl w:val="0"/>
-          <w:numId w:val="1"/>
+          <w:numId w:val="2"/>
         </w:numPr>
-        <w:spacing w:line="360" w:lineRule="auto"/>
       </w:pPr>
       <w:r>
         <w:rPr>
           <w:b/>
           <w:bCs/>
         </w:rPr>
-        <w:t>User Input:</w:t>
-      </w:r>
-      <w:r>
-        <w:t xml:space="preserve"> HR enters employee details (Name, </w:t>
-      </w:r>
-      <w:proofErr w:type="spellStart"/>
-      <w:r>
-        <w:t>Dept</w:t>
-      </w:r>
-      <w:proofErr w:type="spellEnd"/>
-      <w:r>
-        <w:t xml:space="preserve">, </w:t>
-      </w:r>
-      <w:r>
-        <w:t>and Email</w:t>
-      </w:r>
-      <w:r>
-        <w:t>).</w:t>
+        <w:t>The Auditor:</w:t>
+      </w:r>
+      <w:r>
+        <w:t xml:space="preserve"> A dedicated logging module that records every verification status into </w:t>
+      </w:r>
+      <w:r>
+        <w:rPr>
+          <w:rStyle w:val="HTMLCode"/>
+          <w:rFonts w:eastAsiaTheme="majorEastAsia"/>
+        </w:rPr>
+        <w:t>audit_log.txt</w:t>
+      </w:r>
+      <w:r>
+        <w:t xml:space="preserve"> for compliance.</w:t>
+      </w:r>
+    </w:p>
+    <w:p>
+      <w:pPr>
+        <w:pStyle w:val="Heading3"/>
+      </w:pPr>
+      <w:r>
+        <w:t>2. Tool Integrations</w:t>
       </w:r>
     </w:p>
     <w:p>
@@ -163,29 +150,84 @@
         <w:pStyle w:val="NormalWeb"/>
         <w:numPr>
           <w:ilvl w:val="0"/>
-          <w:numId w:val="1"/>
+          <w:numId w:val="3"/>
         </w:numPr>
-        <w:spacing w:line="360" w:lineRule="auto"/>
       </w:pPr>
       <w:r>
         <w:rPr>
           <w:b/>
           <w:bCs/>
         </w:rPr>
-        <w:t>Security Layer:</w:t>
-      </w:r>
-      <w:r>
-        <w:t xml:space="preserve"> The system calls </w:t>
+        <w:t>Frontend:</w:t>
+      </w:r>
+      <w:r>
+        <w:t xml:space="preserve"> Streamlit.</w:t>
+      </w:r>
+    </w:p>
+    <w:p>
+      <w:pPr>
+        <w:pStyle w:val="NormalWeb"/>
+        <w:numPr>
+          <w:ilvl w:val="0"/>
+          <w:numId w:val="3"/>
+        </w:numPr>
+      </w:pPr>
+      <w:r>
+        <w:rPr>
+          <w:b/>
+          <w:bCs/>
+        </w:rPr>
+        <w:t>AI Backend:</w:t>
+      </w:r>
+      <w:r>
+        <w:t xml:space="preserve"> Google Generative AI (Gemini API).</w:t>
+      </w:r>
+    </w:p>
+    <w:p>
+      <w:pPr>
+        <w:pStyle w:val="NormalWeb"/>
+        <w:numPr>
+          <w:ilvl w:val="0"/>
+          <w:numId w:val="3"/>
+        </w:numPr>
+      </w:pPr>
+      <w:r>
+        <w:rPr>
+          <w:b/>
+          <w:bCs/>
+        </w:rPr>
+        <w:t>Security:</w:t>
+      </w:r>
+      <w:r>
+        <w:t xml:space="preserve"> </w:t>
       </w:r>
       <w:r>
         <w:rPr>
           <w:rStyle w:val="HTMLCode"/>
           <w:rFonts w:eastAsiaTheme="majorEastAsia"/>
         </w:rPr>
-        <w:t>os.getenv</w:t>
-      </w:r>
-      <w:r>
-        <w:t xml:space="preserve"> to fetch the secret API Key.</w:t>
+        <w:t>python-dotenv</w:t>
+      </w:r>
+      <w:r>
+        <w:t xml:space="preserve"> for managing private API secrets via </w:t>
+      </w:r>
+      <w:r>
+        <w:rPr>
+          <w:rStyle w:val="HTMLCode"/>
+          <w:rFonts w:eastAsiaTheme="majorEastAsia"/>
+        </w:rPr>
+        <w:t>.env</w:t>
+      </w:r>
+      <w:r>
+        <w:t>.</w:t>
+      </w:r>
+    </w:p>
+    <w:p>
+      <w:pPr>
+        <w:pStyle w:val="Heading3"/>
+      </w:pPr>
+      <w:r>
+        <w:t>3. Error-Handling Logic (Critical for Judges)</w:t>
       </w:r>
     </w:p>
     <w:p>
@@ -193,19 +235,28 @@
         <w:pStyle w:val="NormalWeb"/>
         <w:numPr>
           <w:ilvl w:val="0"/>
-          <w:numId w:val="1"/>
+          <w:numId w:val="4"/>
         </w:numPr>
-        <w:spacing w:line="360" w:lineRule="auto"/>
       </w:pPr>
       <w:r>
         <w:rPr>
           <w:b/>
           <w:bCs/>
         </w:rPr>
-        <w:t>API Request:</w:t>
-      </w:r>
-      <w:r>
-        <w:t xml:space="preserve"> The Python script sends a JSON payload to Google’s Gemini Servers.</w:t>
+        <w:t>Missing API Key:</w:t>
+      </w:r>
+      <w:r>
+        <w:t xml:space="preserve"> The system checks for the </w:t>
+      </w:r>
+      <w:r>
+        <w:rPr>
+          <w:rStyle w:val="HTMLCode"/>
+          <w:rFonts w:eastAsiaTheme="majorEastAsia"/>
+        </w:rPr>
+        <w:t>.env</w:t>
+      </w:r>
+      <w:r>
+        <w:t xml:space="preserve"> file; if missing, it prompts the user to configure the environment rather than crashing.</w:t>
       </w:r>
     </w:p>
     <w:p>
@@ -213,19 +264,18 @@
         <w:pStyle w:val="NormalWeb"/>
         <w:numPr>
           <w:ilvl w:val="0"/>
-          <w:numId w:val="1"/>
+          <w:numId w:val="4"/>
         </w:numPr>
-        <w:spacing w:line="360" w:lineRule="auto"/>
       </w:pPr>
       <w:r>
         <w:rPr>
           <w:b/>
           <w:bCs/>
         </w:rPr>
-        <w:t>AI Generation:</w:t>
-      </w:r>
-      <w:r>
-        <w:t xml:space="preserve"> Gemini processes the prompt and returns a professional summary.</w:t>
+        <w:t>Invalid File Upload:</w:t>
+      </w:r>
+      <w:r>
+        <w:t xml:space="preserve"> If a non-image file is uploaded, the UI triggers an error message to prevent the Vision Agent from processing corrupted data.</w:t>
       </w:r>
     </w:p>
     <w:p>
@@ -233,26 +283,29 @@
         <w:pStyle w:val="NormalWeb"/>
         <w:numPr>
           <w:ilvl w:val="0"/>
-          <w:numId w:val="1"/>
+          <w:numId w:val="4"/>
         </w:numPr>
-        <w:spacing w:line="360" w:lineRule="auto"/>
       </w:pPr>
       <w:r>
         <w:rPr>
           <w:b/>
           <w:bCs/>
         </w:rPr>
-        <w:t>Display:</w:t>
-      </w:r>
-      <w:r>
-        <w:t xml:space="preserve"> The result is printed in the terminal (or later, on your website).</w:t>
+        <w:t>Extraction Failure:</w:t>
+      </w:r>
+      <w:r>
+        <w:t xml:space="preserve"> If Gemini cannot find a Name or ID number, the agent flags the record as "Manual Review Required" in the audit log instead of saving false data.</w:t>
       </w:r>
     </w:p>
     <w:p>
       <w:pPr>
-        <w:spacing w:line="360" w:lineRule="auto"/>
-      </w:pPr>
+        <w:pStyle w:val="NormalWeb"/>
+        <w:ind w:left="360"/>
+      </w:pPr>
+      <w:bookmarkStart w:id="0" w:name="_GoBack"/>
+      <w:bookmarkEnd w:id="0"/>
     </w:p>
+    <w:p/>
     <w:sectPr>
       <w:pgSz w:w="11906" w:h="16838"/>
       <w:pgMar w:top="1440" w:right="1440" w:bottom="1440" w:left="1440" w:header="708" w:footer="708" w:gutter="0"/>
@@ -266,6 +319,304 @@
 <file path=word/numbering.xml><?xml version="1.0" encoding="utf-8"?>
 <w:numbering xmlns:wpc="http://schemas.microsoft.com/office/word/2010/wordprocessingCanvas" xmlns:mc="http://schemas.openxmlformats.org/markup-compatibility/2006" xmlns:o="urn:schemas-microsoft-com:office:office" xmlns:r="http://schemas.openxmlformats.org/officeDocument/2006/relationships" xmlns:m="http://schemas.openxmlformats.org/officeDocument/2006/math" xmlns:v="urn:schemas-microsoft-com:vml" xmlns:wp14="http://schemas.microsoft.com/office/word/2010/wordprocessingDrawing" xmlns:wp="http://schemas.openxmlformats.org/drawingml/2006/wordprocessingDrawing" xmlns:w10="urn:schemas-microsoft-com:office:word" xmlns:w="http://schemas.openxmlformats.org/wordprocessingml/2006/main" xmlns:w14="http://schemas.microsoft.com/office/word/2010/wordml" xmlns:w15="http://schemas.microsoft.com/office/word/2012/wordml" xmlns:wpg="http://schemas.microsoft.com/office/word/2010/wordprocessingGroup" xmlns:wpi="http://schemas.microsoft.com/office/word/2010/wordprocessingInk" xmlns:wne="http://schemas.microsoft.com/office/word/2006/wordml" xmlns:wps="http://schemas.microsoft.com/office/word/2010/wordprocessingShape" mc:Ignorable="w14 w15 wp14">
   <w:abstractNum w:abstractNumId="0" w15:restartNumberingAfterBreak="0">
+    <w:nsid w:val="0D8A252A"/>
+    <w:multiLevelType w:val="multilevel"/>
+    <w:tmpl w:val="0A188EE2"/>
+    <w:lvl w:ilvl="0">
+      <w:start w:val="1"/>
+      <w:numFmt w:val="bullet"/>
+      <w:lvlText w:val=""/>
+      <w:lvlJc w:val="left"/>
+      <w:pPr>
+        <w:tabs>
+          <w:tab w:val="num" w:pos="720"/>
+        </w:tabs>
+        <w:ind w:left="720" w:hanging="360"/>
+      </w:pPr>
+      <w:rPr>
+        <w:rFonts w:ascii="Symbol" w:hAnsi="Symbol" w:hint="default"/>
+        <w:sz w:val="20"/>
+      </w:rPr>
+    </w:lvl>
+    <w:lvl w:ilvl="1" w:tentative="1">
+      <w:start w:val="1"/>
+      <w:numFmt w:val="bullet"/>
+      <w:lvlText w:val="o"/>
+      <w:lvlJc w:val="left"/>
+      <w:pPr>
+        <w:tabs>
+          <w:tab w:val="num" w:pos="1440"/>
+        </w:tabs>
+        <w:ind w:left="1440" w:hanging="360"/>
+      </w:pPr>
+      <w:rPr>
+        <w:rFonts w:ascii="Courier New" w:hAnsi="Courier New" w:hint="default"/>
+        <w:sz w:val="20"/>
+      </w:rPr>
+    </w:lvl>
+    <w:lvl w:ilvl="2" w:tentative="1">
+      <w:start w:val="1"/>
+      <w:numFmt w:val="bullet"/>
+      <w:lvlText w:val=""/>
+      <w:lvlJc w:val="left"/>
+      <w:pPr>
+        <w:tabs>
+          <w:tab w:val="num" w:pos="2160"/>
+        </w:tabs>
+        <w:ind w:left="2160" w:hanging="360"/>
+      </w:pPr>
+      <w:rPr>
+        <w:rFonts w:ascii="Wingdings" w:hAnsi="Wingdings" w:hint="default"/>
+        <w:sz w:val="20"/>
+      </w:rPr>
+    </w:lvl>
+    <w:lvl w:ilvl="3" w:tentative="1">
+      <w:start w:val="1"/>
+      <w:numFmt w:val="bullet"/>
+      <w:lvlText w:val=""/>
+      <w:lvlJc w:val="left"/>
+      <w:pPr>
+        <w:tabs>
+          <w:tab w:val="num" w:pos="2880"/>
+        </w:tabs>
+        <w:ind w:left="2880" w:hanging="360"/>
+      </w:pPr>
+      <w:rPr>
+        <w:rFonts w:ascii="Wingdings" w:hAnsi="Wingdings" w:hint="default"/>
+        <w:sz w:val="20"/>
+      </w:rPr>
+    </w:lvl>
+    <w:lvl w:ilvl="4" w:tentative="1">
+      <w:start w:val="1"/>
+      <w:numFmt w:val="bullet"/>
+      <w:lvlText w:val=""/>
+      <w:lvlJc w:val="left"/>
+      <w:pPr>
+        <w:tabs>
+          <w:tab w:val="num" w:pos="3600"/>
+        </w:tabs>
+        <w:ind w:left="3600" w:hanging="360"/>
+      </w:pPr>
+      <w:rPr>
+        <w:rFonts w:ascii="Wingdings" w:hAnsi="Wingdings" w:hint="default"/>
+        <w:sz w:val="20"/>
+      </w:rPr>
+    </w:lvl>
+    <w:lvl w:ilvl="5" w:tentative="1">
+      <w:start w:val="1"/>
+      <w:numFmt w:val="bullet"/>
+      <w:lvlText w:val=""/>
+      <w:lvlJc w:val="left"/>
+      <w:pPr>
+        <w:tabs>
+          <w:tab w:val="num" w:pos="4320"/>
+        </w:tabs>
+        <w:ind w:left="4320" w:hanging="360"/>
+      </w:pPr>
+      <w:rPr>
+        <w:rFonts w:ascii="Wingdings" w:hAnsi="Wingdings" w:hint="default"/>
+        <w:sz w:val="20"/>
+      </w:rPr>
+    </w:lvl>
+    <w:lvl w:ilvl="6" w:tentative="1">
+      <w:start w:val="1"/>
+      <w:numFmt w:val="bullet"/>
+      <w:lvlText w:val=""/>
+      <w:lvlJc w:val="left"/>
+      <w:pPr>
+        <w:tabs>
+          <w:tab w:val="num" w:pos="5040"/>
+        </w:tabs>
+        <w:ind w:left="5040" w:hanging="360"/>
+      </w:pPr>
+      <w:rPr>
+        <w:rFonts w:ascii="Wingdings" w:hAnsi="Wingdings" w:hint="default"/>
+        <w:sz w:val="20"/>
+      </w:rPr>
+    </w:lvl>
+    <w:lvl w:ilvl="7" w:tentative="1">
+      <w:start w:val="1"/>
+      <w:numFmt w:val="bullet"/>
+      <w:lvlText w:val=""/>
+      <w:lvlJc w:val="left"/>
+      <w:pPr>
+        <w:tabs>
+          <w:tab w:val="num" w:pos="5760"/>
+        </w:tabs>
+        <w:ind w:left="5760" w:hanging="360"/>
+      </w:pPr>
+      <w:rPr>
+        <w:rFonts w:ascii="Wingdings" w:hAnsi="Wingdings" w:hint="default"/>
+        <w:sz w:val="20"/>
+      </w:rPr>
+    </w:lvl>
+    <w:lvl w:ilvl="8" w:tentative="1">
+      <w:start w:val="1"/>
+      <w:numFmt w:val="bullet"/>
+      <w:lvlText w:val=""/>
+      <w:lvlJc w:val="left"/>
+      <w:pPr>
+        <w:tabs>
+          <w:tab w:val="num" w:pos="6480"/>
+        </w:tabs>
+        <w:ind w:left="6480" w:hanging="360"/>
+      </w:pPr>
+      <w:rPr>
+        <w:rFonts w:ascii="Wingdings" w:hAnsi="Wingdings" w:hint="default"/>
+        <w:sz w:val="20"/>
+      </w:rPr>
+    </w:lvl>
+  </w:abstractNum>
+  <w:abstractNum w:abstractNumId="1" w15:restartNumberingAfterBreak="0">
+    <w:nsid w:val="0EEC189F"/>
+    <w:multiLevelType w:val="multilevel"/>
+    <w:tmpl w:val="9962EC08"/>
+    <w:lvl w:ilvl="0">
+      <w:start w:val="1"/>
+      <w:numFmt w:val="bullet"/>
+      <w:lvlText w:val=""/>
+      <w:lvlJc w:val="left"/>
+      <w:pPr>
+        <w:tabs>
+          <w:tab w:val="num" w:pos="720"/>
+        </w:tabs>
+        <w:ind w:left="720" w:hanging="360"/>
+      </w:pPr>
+      <w:rPr>
+        <w:rFonts w:ascii="Symbol" w:hAnsi="Symbol" w:hint="default"/>
+        <w:sz w:val="20"/>
+      </w:rPr>
+    </w:lvl>
+    <w:lvl w:ilvl="1" w:tentative="1">
+      <w:start w:val="1"/>
+      <w:numFmt w:val="bullet"/>
+      <w:lvlText w:val="o"/>
+      <w:lvlJc w:val="left"/>
+      <w:pPr>
+        <w:tabs>
+          <w:tab w:val="num" w:pos="1440"/>
+        </w:tabs>
+        <w:ind w:left="1440" w:hanging="360"/>
+      </w:pPr>
+      <w:rPr>
+        <w:rFonts w:ascii="Courier New" w:hAnsi="Courier New" w:hint="default"/>
+        <w:sz w:val="20"/>
+      </w:rPr>
+    </w:lvl>
+    <w:lvl w:ilvl="2" w:tentative="1">
+      <w:start w:val="1"/>
+      <w:numFmt w:val="bullet"/>
+      <w:lvlText w:val=""/>
+      <w:lvlJc w:val="left"/>
+      <w:pPr>
+        <w:tabs>
+          <w:tab w:val="num" w:pos="2160"/>
+        </w:tabs>
+        <w:ind w:left="2160" w:hanging="360"/>
+      </w:pPr>
+      <w:rPr>
+        <w:rFonts w:ascii="Wingdings" w:hAnsi="Wingdings" w:hint="default"/>
+        <w:sz w:val="20"/>
+      </w:rPr>
+    </w:lvl>
+    <w:lvl w:ilvl="3" w:tentative="1">
+      <w:start w:val="1"/>
+      <w:numFmt w:val="bullet"/>
+      <w:lvlText w:val=""/>
+      <w:lvlJc w:val="left"/>
+      <w:pPr>
+        <w:tabs>
+          <w:tab w:val="num" w:pos="2880"/>
+        </w:tabs>
+        <w:ind w:left="2880" w:hanging="360"/>
+      </w:pPr>
+      <w:rPr>
+        <w:rFonts w:ascii="Wingdings" w:hAnsi="Wingdings" w:hint="default"/>
+        <w:sz w:val="20"/>
+      </w:rPr>
+    </w:lvl>
+    <w:lvl w:ilvl="4" w:tentative="1">
+      <w:start w:val="1"/>
+      <w:numFmt w:val="bullet"/>
+      <w:lvlText w:val=""/>
+      <w:lvlJc w:val="left"/>
+      <w:pPr>
+        <w:tabs>
+          <w:tab w:val="num" w:pos="3600"/>
+        </w:tabs>
+        <w:ind w:left="3600" w:hanging="360"/>
+      </w:pPr>
+      <w:rPr>
+        <w:rFonts w:ascii="Wingdings" w:hAnsi="Wingdings" w:hint="default"/>
+        <w:sz w:val="20"/>
+      </w:rPr>
+    </w:lvl>
+    <w:lvl w:ilvl="5" w:tentative="1">
+      <w:start w:val="1"/>
+      <w:numFmt w:val="bullet"/>
+      <w:lvlText w:val=""/>
+      <w:lvlJc w:val="left"/>
+      <w:pPr>
+        <w:tabs>
+          <w:tab w:val="num" w:pos="4320"/>
+        </w:tabs>
+        <w:ind w:left="4320" w:hanging="360"/>
+      </w:pPr>
+      <w:rPr>
+        <w:rFonts w:ascii="Wingdings" w:hAnsi="Wingdings" w:hint="default"/>
+        <w:sz w:val="20"/>
+      </w:rPr>
+    </w:lvl>
+    <w:lvl w:ilvl="6" w:tentative="1">
+      <w:start w:val="1"/>
+      <w:numFmt w:val="bullet"/>
+      <w:lvlText w:val=""/>
+      <w:lvlJc w:val="left"/>
+      <w:pPr>
+        <w:tabs>
+          <w:tab w:val="num" w:pos="5040"/>
+        </w:tabs>
+        <w:ind w:left="5040" w:hanging="360"/>
+      </w:pPr>
+      <w:rPr>
+        <w:rFonts w:ascii="Wingdings" w:hAnsi="Wingdings" w:hint="default"/>
+        <w:sz w:val="20"/>
+      </w:rPr>
+    </w:lvl>
+    <w:lvl w:ilvl="7" w:tentative="1">
+      <w:start w:val="1"/>
+      <w:numFmt w:val="bullet"/>
+      <w:lvlText w:val=""/>
+      <w:lvlJc w:val="left"/>
+      <w:pPr>
+        <w:tabs>
+          <w:tab w:val="num" w:pos="5760"/>
+        </w:tabs>
+        <w:ind w:left="5760" w:hanging="360"/>
+      </w:pPr>
+      <w:rPr>
+        <w:rFonts w:ascii="Wingdings" w:hAnsi="Wingdings" w:hint="default"/>
+        <w:sz w:val="20"/>
+      </w:rPr>
+    </w:lvl>
+    <w:lvl w:ilvl="8" w:tentative="1">
+      <w:start w:val="1"/>
+      <w:numFmt w:val="bullet"/>
+      <w:lvlText w:val=""/>
+      <w:lvlJc w:val="left"/>
+      <w:pPr>
+        <w:tabs>
+          <w:tab w:val="num" w:pos="6480"/>
+        </w:tabs>
+        <w:ind w:left="6480" w:hanging="360"/>
+      </w:pPr>
+      <w:rPr>
+        <w:rFonts w:ascii="Wingdings" w:hAnsi="Wingdings" w:hint="default"/>
+        <w:sz w:val="20"/>
+      </w:rPr>
+    </w:lvl>
+  </w:abstractNum>
+  <w:abstractNum w:abstractNumId="2" w15:restartNumberingAfterBreak="0">
     <w:nsid w:val="715401C0"/>
     <w:multiLevelType w:val="multilevel"/>
     <w:tmpl w:val="A35442FC"/>
@@ -378,8 +729,166 @@
       </w:pPr>
     </w:lvl>
   </w:abstractNum>
+  <w:abstractNum w:abstractNumId="3" w15:restartNumberingAfterBreak="0">
+    <w:nsid w:val="72FE5D94"/>
+    <w:multiLevelType w:val="multilevel"/>
+    <w:tmpl w:val="64AA36DC"/>
+    <w:lvl w:ilvl="0">
+      <w:start w:val="1"/>
+      <w:numFmt w:val="bullet"/>
+      <w:lvlText w:val=""/>
+      <w:lvlJc w:val="left"/>
+      <w:pPr>
+        <w:tabs>
+          <w:tab w:val="num" w:pos="720"/>
+        </w:tabs>
+        <w:ind w:left="720" w:hanging="360"/>
+      </w:pPr>
+      <w:rPr>
+        <w:rFonts w:ascii="Symbol" w:hAnsi="Symbol" w:hint="default"/>
+        <w:sz w:val="20"/>
+      </w:rPr>
+    </w:lvl>
+    <w:lvl w:ilvl="1" w:tentative="1">
+      <w:start w:val="1"/>
+      <w:numFmt w:val="bullet"/>
+      <w:lvlText w:val="o"/>
+      <w:lvlJc w:val="left"/>
+      <w:pPr>
+        <w:tabs>
+          <w:tab w:val="num" w:pos="1440"/>
+        </w:tabs>
+        <w:ind w:left="1440" w:hanging="360"/>
+      </w:pPr>
+      <w:rPr>
+        <w:rFonts w:ascii="Courier New" w:hAnsi="Courier New" w:hint="default"/>
+        <w:sz w:val="20"/>
+      </w:rPr>
+    </w:lvl>
+    <w:lvl w:ilvl="2" w:tentative="1">
+      <w:start w:val="1"/>
+      <w:numFmt w:val="bullet"/>
+      <w:lvlText w:val=""/>
+      <w:lvlJc w:val="left"/>
+      <w:pPr>
+        <w:tabs>
+          <w:tab w:val="num" w:pos="2160"/>
+        </w:tabs>
+        <w:ind w:left="2160" w:hanging="360"/>
+      </w:pPr>
+      <w:rPr>
+        <w:rFonts w:ascii="Wingdings" w:hAnsi="Wingdings" w:hint="default"/>
+        <w:sz w:val="20"/>
+      </w:rPr>
+    </w:lvl>
+    <w:lvl w:ilvl="3" w:tentative="1">
+      <w:start w:val="1"/>
+      <w:numFmt w:val="bullet"/>
+      <w:lvlText w:val=""/>
+      <w:lvlJc w:val="left"/>
+      <w:pPr>
+        <w:tabs>
+          <w:tab w:val="num" w:pos="2880"/>
+        </w:tabs>
+        <w:ind w:left="2880" w:hanging="360"/>
+      </w:pPr>
+      <w:rPr>
+        <w:rFonts w:ascii="Wingdings" w:hAnsi="Wingdings" w:hint="default"/>
+        <w:sz w:val="20"/>
+      </w:rPr>
+    </w:lvl>
+    <w:lvl w:ilvl="4" w:tentative="1">
+      <w:start w:val="1"/>
+      <w:numFmt w:val="bullet"/>
+      <w:lvlText w:val=""/>
+      <w:lvlJc w:val="left"/>
+      <w:pPr>
+        <w:tabs>
+          <w:tab w:val="num" w:pos="3600"/>
+        </w:tabs>
+        <w:ind w:left="3600" w:hanging="360"/>
+      </w:pPr>
+      <w:rPr>
+        <w:rFonts w:ascii="Wingdings" w:hAnsi="Wingdings" w:hint="default"/>
+        <w:sz w:val="20"/>
+      </w:rPr>
+    </w:lvl>
+    <w:lvl w:ilvl="5" w:tentative="1">
+      <w:start w:val="1"/>
+      <w:numFmt w:val="bullet"/>
+      <w:lvlText w:val=""/>
+      <w:lvlJc w:val="left"/>
+      <w:pPr>
+        <w:tabs>
+          <w:tab w:val="num" w:pos="4320"/>
+        </w:tabs>
+        <w:ind w:left="4320" w:hanging="360"/>
+      </w:pPr>
+      <w:rPr>
+        <w:rFonts w:ascii="Wingdings" w:hAnsi="Wingdings" w:hint="default"/>
+        <w:sz w:val="20"/>
+      </w:rPr>
+    </w:lvl>
+    <w:lvl w:ilvl="6" w:tentative="1">
+      <w:start w:val="1"/>
+      <w:numFmt w:val="bullet"/>
+      <w:lvlText w:val=""/>
+      <w:lvlJc w:val="left"/>
+      <w:pPr>
+        <w:tabs>
+          <w:tab w:val="num" w:pos="5040"/>
+        </w:tabs>
+        <w:ind w:left="5040" w:hanging="360"/>
+      </w:pPr>
+      <w:rPr>
+        <w:rFonts w:ascii="Wingdings" w:hAnsi="Wingdings" w:hint="default"/>
+        <w:sz w:val="20"/>
+      </w:rPr>
+    </w:lvl>
+    <w:lvl w:ilvl="7" w:tentative="1">
+      <w:start w:val="1"/>
+      <w:numFmt w:val="bullet"/>
+      <w:lvlText w:val=""/>
+      <w:lvlJc w:val="left"/>
+      <w:pPr>
+        <w:tabs>
+          <w:tab w:val="num" w:pos="5760"/>
+        </w:tabs>
+        <w:ind w:left="5760" w:hanging="360"/>
+      </w:pPr>
+      <w:rPr>
+        <w:rFonts w:ascii="Wingdings" w:hAnsi="Wingdings" w:hint="default"/>
+        <w:sz w:val="20"/>
+      </w:rPr>
+    </w:lvl>
+    <w:lvl w:ilvl="8" w:tentative="1">
+      <w:start w:val="1"/>
+      <w:numFmt w:val="bullet"/>
+      <w:lvlText w:val=""/>
+      <w:lvlJc w:val="left"/>
+      <w:pPr>
+        <w:tabs>
+          <w:tab w:val="num" w:pos="6480"/>
+        </w:tabs>
+        <w:ind w:left="6480" w:hanging="360"/>
+      </w:pPr>
+      <w:rPr>
+        <w:rFonts w:ascii="Wingdings" w:hAnsi="Wingdings" w:hint="default"/>
+        <w:sz w:val="20"/>
+      </w:rPr>
+    </w:lvl>
+  </w:abstractNum>
   <w:num w:numId="1">
+    <w:abstractNumId w:val="2"/>
+  </w:num>
+  <w:num w:numId="2">
+    <w:abstractNumId w:val="3"/>
+  </w:num>
+  <w:num w:numId="3">
     <w:abstractNumId w:val="0"/>
+  </w:num>
+  <w:num w:numId="4">
+    <w:abstractNumId w:val="1"/>
   </w:num>
 </w:numbering>
 </file>
@@ -1328,6 +1837,31 @@
       <w:szCs w:val="20"/>
     </w:rPr>
   </w:style>
+  <w:style w:type="character" w:styleId="BookTitle">
+    <w:name w:val="Book Title"/>
+    <w:basedOn w:val="DefaultParagraphFont"/>
+    <w:uiPriority w:val="33"/>
+    <w:qFormat/>
+    <w:rsid w:val="00D13015"/>
+    <w:rPr>
+      <w:b/>
+      <w:bCs/>
+      <w:i/>
+      <w:iCs/>
+      <w:spacing w:val="5"/>
+    </w:rPr>
+  </w:style>
+  <w:style w:type="character" w:styleId="Strong">
+    <w:name w:val="Strong"/>
+    <w:basedOn w:val="DefaultParagraphFont"/>
+    <w:uiPriority w:val="22"/>
+    <w:qFormat/>
+    <w:rsid w:val="00D13015"/>
+    <w:rPr>
+      <w:b/>
+      <w:bCs/>
+    </w:rPr>
+  </w:style>
 </w:styles>
 </file>
 

</xml_diff>